<commit_message>
This is Joe Dainis, reviewer #2 for your manuscript. I have reviewed it and created a pull request for you to merge into your repository. Very nice work!
</commit_message>
<xml_diff>
--- a/products/manuscript/Manuscript.docx
+++ b/products/manuscript/Manuscript.docx
@@ -97,7 +97,7 @@
         <w:br w:type="page"/>
       </w:r>
     </w:p>
-    <w:bookmarkStart w:id="9" w:name="abstract"/>
+    <w:bookmarkStart w:id="20" w:name="abstract"/>
     <w:p>
       <w:pPr>
         <w:pStyle w:val="Heading1"/>
@@ -143,8 +143,8 @@
         <w:br w:type="page"/>
       </w:r>
     </w:p>
-    <w:bookmarkEnd w:id="9"/>
-    <w:bookmarkStart w:id="13" w:name="introduction"/>
+    <w:bookmarkEnd w:id="20"/>
+    <w:bookmarkStart w:id="24" w:name="introduction"/>
     <w:p>
       <w:pPr>
         <w:pStyle w:val="Heading1"/>
@@ -153,7 +153,7 @@
         <w:t xml:space="preserve">2. Introduction</w:t>
       </w:r>
     </w:p>
-    <w:bookmarkStart w:id="10" w:name="general-background-information"/>
+    <w:bookmarkStart w:id="21" w:name="general-background-information"/>
     <w:p>
       <w:pPr>
         <w:pStyle w:val="Heading2"/>
@@ -214,8 +214,8 @@
         <w:t xml:space="preserve">.</w:t>
       </w:r>
     </w:p>
-    <w:bookmarkEnd w:id="10"/>
-    <w:bookmarkStart w:id="11" w:name="description-of-data-and-data-source"/>
+    <w:bookmarkEnd w:id="21"/>
+    <w:bookmarkStart w:id="22" w:name="description-of-data-and-data-source"/>
     <w:p>
       <w:pPr>
         <w:pStyle w:val="Heading2"/>
@@ -232,8 +232,8 @@
         <w:t xml:space="preserve">We used data from the Health and Retirement Study (HRS), a nationally representative longitudinal survey of U.S. adults aged 50 and older, with biennial follow-up. The study period spans 1996–2020 (up to 13 waves). HRS collects repeated measures on demographics, socioeconomic status, health behaviors, and health conditions, and includes cognitive assessments that allow dementia classification. Cognitive status was classified using the Langa-Weir algorithm, which categorizes respondents into normal cognition, cognitive impairment no dementia (CIND), and dementia based on cognitive test scores.</w:t>
       </w:r>
     </w:p>
-    <w:bookmarkEnd w:id="11"/>
-    <w:bookmarkStart w:id="12" w:name="questionshypotheses-to-be-addressed"/>
+    <w:bookmarkEnd w:id="22"/>
+    <w:bookmarkStart w:id="23" w:name="questionshypotheses-to-be-addressed"/>
     <w:p>
       <w:pPr>
         <w:pStyle w:val="Heading2"/>
@@ -263,9 +263,9 @@
         <w:br w:type="page"/>
       </w:r>
     </w:p>
-    <w:bookmarkEnd w:id="12"/>
-    <w:bookmarkEnd w:id="13"/>
-    <w:bookmarkStart w:id="20" w:name="methods"/>
+    <w:bookmarkEnd w:id="23"/>
+    <w:bookmarkEnd w:id="24"/>
+    <w:bookmarkStart w:id="31" w:name="methods"/>
     <w:p>
       <w:pPr>
         <w:pStyle w:val="Heading1"/>
@@ -274,7 +274,7 @@
         <w:t xml:space="preserve">3. Methods</w:t>
       </w:r>
     </w:p>
-    <w:bookmarkStart w:id="14" w:name="study-design"/>
+    <w:bookmarkStart w:id="25" w:name="study-design"/>
     <w:p>
       <w:pPr>
         <w:pStyle w:val="Heading2"/>
@@ -299,8 +299,8 @@
         <w:t xml:space="preserve">We constructed landmark datasets at each wave from W3 (year 2000) through W9 (year 2012). For each landmark, individuals were required to have been observed in all preceding waves beginning with W1 (1996) and to have been free of CIND or dementia through the landmark wave. Follow-up for dementia events began at the landmark wave and continued through the last available observation.</w:t>
       </w:r>
     </w:p>
-    <w:bookmarkEnd w:id="14"/>
-    <w:bookmarkStart w:id="15" w:name="exposure-bmi-variability"/>
+    <w:bookmarkEnd w:id="25"/>
+    <w:bookmarkStart w:id="26" w:name="exposure-bmi-variability"/>
     <w:p>
       <w:pPr>
         <w:pStyle w:val="Heading2"/>
@@ -355,25 +355,23 @@
               <m:r>
                 <m:t>D</m:t>
               </m:r>
-              <m:r>
-                <m:rPr>
-                  <m:sty m:val="p"/>
-                </m:rPr>
-                <m:t>(</m:t>
-              </m:r>
-              <m:r>
-                <m:rPr>
-                  <m:nor/>
-                  <m:sty m:val="p"/>
-                </m:rPr>
-                <m:t>BMI</m:t>
-              </m:r>
-              <m:r>
-                <m:rPr>
-                  <m:sty m:val="p"/>
-                </m:rPr>
-                <m:t>)</m:t>
-              </m:r>
+              <m:d>
+                <m:dPr>
+                  <m:begChr m:val="("/>
+                  <m:sepChr m:val=""/>
+                  <m:endChr m:val=")"/>
+                  <m:grow/>
+                </m:dPr>
+                <m:e>
+                  <m:r>
+                    <m:rPr>
+                      <m:nor/>
+                      <m:sty m:val="p"/>
+                    </m:rPr>
+                    <m:t>BMI</m:t>
+                  </m:r>
+                </m:e>
+              </m:d>
             </m:num>
             <m:den>
               <m:r>
@@ -388,25 +386,23 @@
               <m:r>
                 <m:t>N</m:t>
               </m:r>
-              <m:r>
-                <m:rPr>
-                  <m:sty m:val="p"/>
-                </m:rPr>
-                <m:t>(</m:t>
-              </m:r>
-              <m:r>
-                <m:rPr>
-                  <m:nor/>
-                  <m:sty m:val="p"/>
-                </m:rPr>
-                <m:t>BMI</m:t>
-              </m:r>
-              <m:r>
-                <m:rPr>
-                  <m:sty m:val="p"/>
-                </m:rPr>
-                <m:t>)</m:t>
-              </m:r>
+              <m:d>
+                <m:dPr>
+                  <m:begChr m:val="("/>
+                  <m:sepChr m:val=""/>
+                  <m:endChr m:val=")"/>
+                  <m:grow/>
+                </m:dPr>
+                <m:e>
+                  <m:r>
+                    <m:rPr>
+                      <m:nor/>
+                      <m:sty m:val="p"/>
+                    </m:rPr>
+                    <m:t>BMI</m:t>
+                  </m:r>
+                </m:e>
+              </m:d>
             </m:den>
           </m:f>
           <m:r>
@@ -429,8 +425,8 @@
         <w:t xml:space="preserve">To handle missing BMI values within the exposure window, we applied linear interpolation across waves. BMI CV% was examined both as a continuous variable and categorized into tertiles (low, medium, and high variability). Tertile cutpoints were derived from the W9 window distribution (the longest available follow-up window, spanning 1996–2012) to ensure consistent classification thresholds across all landmark windows: low (≤3.9%), medium (&gt;3.9% to ≤6.5%), and high (&gt;6.5%).</w:t>
       </w:r>
     </w:p>
-    <w:bookmarkEnd w:id="15"/>
-    <w:bookmarkStart w:id="16" w:name="outcome"/>
+    <w:bookmarkEnd w:id="26"/>
+    <w:bookmarkStart w:id="27" w:name="outcome"/>
     <w:p>
       <w:pPr>
         <w:pStyle w:val="Heading2"/>
@@ -459,8 +455,8 @@
         <w:t xml:space="preserve">by the Langa-Weir algorithm following the landmark wave. Once a dementia event was recorded, subsequent observations for that individual were censored.</w:t>
       </w:r>
     </w:p>
-    <w:bookmarkEnd w:id="16"/>
-    <w:bookmarkStart w:id="17" w:name="covariates"/>
+    <w:bookmarkEnd w:id="27"/>
+    <w:bookmarkStart w:id="28" w:name="covariates"/>
     <w:p>
       <w:pPr>
         <w:pStyle w:val="Heading2"/>
@@ -477,8 +473,8 @@
         <w:t xml:space="preserve">Models were adjusted for the following baseline covariates: age at baseline, sex, race/ethnicity (Non-Hispanic White, Non-Hispanic Black, Hispanic or Other), education (less than high school, GED, high school graduate, college or above), log-transformed household wealth, number of chronic conditions, health insurance status, employment status (employed, unemployed/not in labor force, retired, disabled), smoking status (never, ever/current), and depression.</w:t>
       </w:r>
     </w:p>
-    <w:bookmarkEnd w:id="17"/>
-    <w:bookmarkStart w:id="18" w:name="statistical-analysis"/>
+    <w:bookmarkEnd w:id="28"/>
+    <w:bookmarkStart w:id="29" w:name="statistical-analysis"/>
     <w:p>
       <w:pPr>
         <w:pStyle w:val="Heading2"/>
@@ -511,8 +507,8 @@
         <w:t xml:space="preserve">The proportional hazards assumption was assessed using Schoenfeld residuals. Main results are presented for W3, W6, and W9 landmark waves to illustrate findings across short, medium, and long exposure measurement windows.</w:t>
       </w:r>
     </w:p>
-    <w:bookmarkEnd w:id="18"/>
-    <w:bookmarkStart w:id="19" w:name="supplementary-machine-learning-analysis"/>
+    <w:bookmarkEnd w:id="29"/>
+    <w:bookmarkStart w:id="30" w:name="supplementary-machine-learning-analysis"/>
     <w:p>
       <w:pPr>
         <w:pStyle w:val="Heading2"/>
@@ -542,9 +538,9 @@
         <w:br w:type="page"/>
       </w:r>
     </w:p>
-    <w:bookmarkEnd w:id="19"/>
-    <w:bookmarkEnd w:id="20"/>
-    <w:bookmarkStart w:id="51" w:name="results"/>
+    <w:bookmarkEnd w:id="30"/>
+    <w:bookmarkEnd w:id="31"/>
+    <w:bookmarkStart w:id="62" w:name="results"/>
     <w:p>
       <w:pPr>
         <w:pStyle w:val="Heading1"/>
@@ -553,7 +549,7 @@
         <w:t xml:space="preserve">4. Results</w:t>
       </w:r>
     </w:p>
-    <w:bookmarkStart w:id="36" w:name="descriptive-analysis"/>
+    <w:bookmarkStart w:id="47" w:name="descriptive-analysis"/>
     <w:p>
       <w:pPr>
         <w:pStyle w:val="Heading2"/>
@@ -562,7 +558,7 @@
         <w:t xml:space="preserve">4.1 Descriptive analysis</w:t>
       </w:r>
     </w:p>
-    <w:bookmarkStart w:id="33" w:name="full-study-population"/>
+    <w:bookmarkStart w:id="44" w:name="full-study-population"/>
     <w:p>
       <w:pPr>
         <w:pStyle w:val="Heading3"/>
@@ -592,7 +588,7 @@
       <w:tr>
         <w:tc>
           <w:tcPr/>
-          <w:bookmarkStart w:id="24" w:name="fig-sample-size"/>
+          <w:bookmarkStart w:id="35" w:name="fig-sample-size"/>
           <w:p>
             <w:pPr>
               <w:pStyle w:val="Compact"/>
@@ -603,18 +599,18 @@
                 <wp:inline>
                   <wp:extent cx="5334000" cy="3333749"/>
                   <wp:effectExtent b="0" l="0" r="0" t="0"/>
-                  <wp:docPr descr="" title="" id="22" name="Picture"/>
+                  <wp:docPr descr="" title="" id="33" name="Picture"/>
                   <a:graphic>
                     <a:graphicData uri="http://schemas.openxmlformats.org/drawingml/2006/picture">
                       <pic:pic>
                         <pic:nvPicPr>
-                          <pic:cNvPr descr="../../results/figures/p1_sample_size_per_wave.png" id="23" name="Picture"/>
+                          <pic:cNvPr descr="../../results/figures/p1_sample_size_per_wave.png" id="34" name="Picture"/>
                           <pic:cNvPicPr>
                             <a:picLocks noChangeArrowheads="1" noChangeAspect="1"/>
                           </pic:cNvPicPr>
                         </pic:nvPicPr>
                         <pic:blipFill>
-                          <a:blip r:embed="rId21"/>
+                          <a:blip r:embed="rId32"/>
                           <a:stretch>
                             <a:fillRect/>
                           </a:stretch>
@@ -654,7 +650,7 @@
               <w:t xml:space="preserve">Figure 1: Sample Size by Wave in the Full Processed Dataset.</w:t>
             </w:r>
           </w:p>
-          <w:bookmarkEnd w:id="24"/>
+          <w:bookmarkEnd w:id="35"/>
         </w:tc>
       </w:tr>
     </w:tbl>
@@ -671,7 +667,7 @@
       <w:tr>
         <w:tc>
           <w:tcPr/>
-          <w:bookmarkStart w:id="28" w:name="fig-cog-wave"/>
+          <w:bookmarkStart w:id="39" w:name="fig-cog-wave"/>
           <w:p>
             <w:pPr>
               <w:pStyle w:val="Compact"/>
@@ -682,18 +678,18 @@
                 <wp:inline>
                   <wp:extent cx="5334000" cy="3200399"/>
                   <wp:effectExtent b="0" l="0" r="0" t="0"/>
-                  <wp:docPr descr="" title="" id="26" name="Picture"/>
+                  <wp:docPr descr="" title="" id="37" name="Picture"/>
                   <a:graphic>
                     <a:graphicData uri="http://schemas.openxmlformats.org/drawingml/2006/picture">
                       <pic:pic>
                         <pic:nvPicPr>
-                          <pic:cNvPr descr="../../results/figures/p2_cogfunction_by_wave.png" id="27" name="Picture"/>
+                          <pic:cNvPr descr="../../results/figures/p2_cogfunction_by_wave.png" id="38" name="Picture"/>
                           <pic:cNvPicPr>
                             <a:picLocks noChangeArrowheads="1" noChangeAspect="1"/>
                           </pic:cNvPicPr>
                         </pic:nvPicPr>
                         <pic:blipFill>
-                          <a:blip r:embed="rId25"/>
+                          <a:blip r:embed="rId36"/>
                           <a:stretch>
                             <a:fillRect/>
                           </a:stretch>
@@ -733,7 +729,7 @@
               <w:t xml:space="preserve">Figure 2: Cognitive Function Distribution by Wave.</w:t>
             </w:r>
           </w:p>
-          <w:bookmarkEnd w:id="28"/>
+          <w:bookmarkEnd w:id="39"/>
         </w:tc>
       </w:tr>
     </w:tbl>
@@ -758,7 +754,7 @@
       <w:tr>
         <w:tc>
           <w:tcPr/>
-          <w:bookmarkStart w:id="32" w:name="fig-bmiv-density"/>
+          <w:bookmarkStart w:id="43" w:name="fig-bmiv-density"/>
           <w:p>
             <w:pPr>
               <w:pStyle w:val="Compact"/>
@@ -769,18 +765,18 @@
                 <wp:inline>
                   <wp:extent cx="5334000" cy="3200399"/>
                   <wp:effectExtent b="0" l="0" r="0" t="0"/>
-                  <wp:docPr descr="" title="" id="30" name="Picture"/>
+                  <wp:docPr descr="" title="" id="41" name="Picture"/>
                   <a:graphic>
                     <a:graphicData uri="http://schemas.openxmlformats.org/drawingml/2006/picture">
                       <pic:pic>
                         <pic:nvPicPr>
-                          <pic:cNvPr descr="../../results/figures/p4_bmi_cv_distribution.png" id="31" name="Picture"/>
+                          <pic:cNvPr descr="../../results/figures/p4_bmi_cv_distribution.png" id="42" name="Picture"/>
                           <pic:cNvPicPr>
                             <a:picLocks noChangeArrowheads="1" noChangeAspect="1"/>
                           </pic:cNvPicPr>
                         </pic:nvPicPr>
                         <pic:blipFill>
-                          <a:blip r:embed="rId29"/>
+                          <a:blip r:embed="rId40"/>
                           <a:stretch>
                             <a:fillRect/>
                           </a:stretch>
@@ -820,12 +816,12 @@
               <w:t xml:space="preserve">Figure 3: Distribution of BMI Variability Measures Across Wave Windows.</w:t>
             </w:r>
           </w:p>
-          <w:bookmarkEnd w:id="32"/>
+          <w:bookmarkEnd w:id="43"/>
         </w:tc>
       </w:tr>
     </w:tbl>
-    <w:bookmarkEnd w:id="33"/>
-    <w:bookmarkStart w:id="35" w:name="w3-analytic-sample"/>
+    <w:bookmarkEnd w:id="44"/>
+    <w:bookmarkStart w:id="46" w:name="w3-analytic-sample"/>
     <w:p>
       <w:pPr>
         <w:pStyle w:val="Heading3"/>
@@ -866,7 +862,7 @@
       <w:tr>
         <w:tc>
           <w:tcPr/>
-          <w:bookmarkStart w:id="34" w:name="tbl-baseline"/>
+          <w:bookmarkStart w:id="45" w:name="tbl-baseline"/>
           <w:p>
             <w:pPr>
               <w:jc w:val="center"/>
@@ -11791,7 +11787,7 @@
               </w:tc>
             </w:tr>
           </w:tbl>
-          <w:bookmarkEnd w:id="34"/>
+          <w:bookmarkEnd w:id="45"/>
         </w:tc>
       </w:tr>
     </w:tbl>
@@ -11803,9 +11799,9 @@
         <w:t xml:space="preserve">Participants in the high-variability group were slightly younger than those in the low-variability group (58.79 vs. 59.67 years, p &lt; 0.001), but had a higher baseline BMI (28.44 vs. 26.91, p &lt; 0.001). Higher BMI variability was also associated with lower log household wealth (11.34 vs. 12.21, p &lt; 0.001), a higher prevalence of multiple chronic conditions (25% vs. 16% with &gt;=2 chronic conditions, p &lt; 0.001), lower insurance coverage (86% vs. 92%, p &lt; 0.001), and more depression (15% vs. 8.4%, p &lt; 0.001). Women and individuals reporting disability were more common in the high-variability group. By contrast, race/ethnicity and smoking status were broadly similar across BMI variability groups, while education showed only modest differences. Overall, higher BMI variability tended to cluster with higher baseline BMI, greater clinical burden, and less favorable socioeconomic conditions.</w:t>
       </w:r>
     </w:p>
-    <w:bookmarkEnd w:id="35"/>
-    <w:bookmarkEnd w:id="36"/>
-    <w:bookmarkStart w:id="38" w:name="cox-regression-analysis"/>
+    <w:bookmarkEnd w:id="46"/>
+    <w:bookmarkEnd w:id="47"/>
+    <w:bookmarkStart w:id="49" w:name="cox-regression-analysis"/>
     <w:p>
       <w:pPr>
         <w:pStyle w:val="Heading2"/>
@@ -11846,7 +11842,7 @@
       <w:tr>
         <w:tc>
           <w:tcPr/>
-          <w:bookmarkStart w:id="37" w:name="tbl-cox-results"/>
+          <w:bookmarkStart w:id="48" w:name="tbl-cox-results"/>
           <w:p>
             <w:pPr>
               <w:jc w:val="center"/>
@@ -15406,7 +15402,7 @@
               </w:tc>
             </w:tr>
           </w:tbl>
-          <w:bookmarkEnd w:id="37"/>
+          <w:bookmarkEnd w:id="48"/>
         </w:tc>
       </w:tr>
     </w:tbl>
@@ -15426,8 +15422,8 @@
         <w:t xml:space="preserve">The association was stronger at the W6 landmark, where a longer measurement window was available. The adjusted continuous HR was 1.06 (95% CI: 1.02–1.10, p = 0.002), and the adjusted categorical HR for high versus low BMIV was 1.44 (95% CI: 0.99–2.10). At the W9 landmark, point estimates remained in the same direction (adjusted continuous HR = 1.05) but did not reach statistical significance, likely because of the smaller sample size (N = 2,660; 63 events).</w:t>
       </w:r>
     </w:p>
-    <w:bookmarkEnd w:id="38"/>
-    <w:bookmarkStart w:id="47" w:name="random-survival-forest-analysis"/>
+    <w:bookmarkEnd w:id="49"/>
+    <w:bookmarkStart w:id="58" w:name="random-survival-forest-analysis"/>
     <w:p>
       <w:pPr>
         <w:pStyle w:val="Heading2"/>
@@ -15491,7 +15487,7 @@
       <w:tr>
         <w:tc>
           <w:tcPr/>
-          <w:bookmarkStart w:id="42" w:name="fig-rsf-w3"/>
+          <w:bookmarkStart w:id="53" w:name="fig-rsf-w3"/>
           <w:p>
             <w:pPr>
               <w:pStyle w:val="Compact"/>
@@ -15502,18 +15498,18 @@
                 <wp:inline>
                   <wp:extent cx="5334000" cy="3333749"/>
                   <wp:effectExtent b="0" l="0" r="0" t="0"/>
-                  <wp:docPr descr="" title="" id="40" name="Picture"/>
+                  <wp:docPr descr="" title="" id="51" name="Picture"/>
                   <a:graphic>
                     <a:graphicData uri="http://schemas.openxmlformats.org/drawingml/2006/picture">
                       <pic:pic>
                         <pic:nvPicPr>
-                          <pic:cNvPr descr="../../results/figures/figureS_rsf_w3_variable_importance.png" id="41" name="Picture"/>
+                          <pic:cNvPr descr="../../results/figures/figureS_rsf_w3_variable_importance.png" id="52" name="Picture"/>
                           <pic:cNvPicPr>
                             <a:picLocks noChangeArrowheads="1" noChangeAspect="1"/>
                           </pic:cNvPicPr>
                         </pic:nvPicPr>
                         <pic:blipFill>
-                          <a:blip r:embed="rId39"/>
+                          <a:blip r:embed="rId50"/>
                           <a:stretch>
                             <a:fillRect/>
                           </a:stretch>
@@ -15553,7 +15549,7 @@
               <w:t xml:space="preserve">Figure 4: Variable importance from W3 Random Survival Forest.</w:t>
             </w:r>
           </w:p>
-          <w:bookmarkEnd w:id="42"/>
+          <w:bookmarkEnd w:id="53"/>
         </w:tc>
       </w:tr>
     </w:tbl>
@@ -15570,7 +15566,7 @@
       <w:tr>
         <w:tc>
           <w:tcPr/>
-          <w:bookmarkStart w:id="46" w:name="fig-rsf-w6"/>
+          <w:bookmarkStart w:id="57" w:name="fig-rsf-w6"/>
           <w:p>
             <w:pPr>
               <w:pStyle w:val="Compact"/>
@@ -15581,18 +15577,18 @@
                 <wp:inline>
                   <wp:extent cx="5334000" cy="3333749"/>
                   <wp:effectExtent b="0" l="0" r="0" t="0"/>
-                  <wp:docPr descr="" title="" id="44" name="Picture"/>
+                  <wp:docPr descr="" title="" id="55" name="Picture"/>
                   <a:graphic>
                     <a:graphicData uri="http://schemas.openxmlformats.org/drawingml/2006/picture">
                       <pic:pic>
                         <pic:nvPicPr>
-                          <pic:cNvPr descr="../../results/figures/figureS_rsf_w6_variable_importance.png" id="45" name="Picture"/>
+                          <pic:cNvPr descr="../../results/figures/figureS_rsf_w6_variable_importance.png" id="56" name="Picture"/>
                           <pic:cNvPicPr>
                             <a:picLocks noChangeArrowheads="1" noChangeAspect="1"/>
                           </pic:cNvPicPr>
                         </pic:nvPicPr>
                         <pic:blipFill>
-                          <a:blip r:embed="rId43"/>
+                          <a:blip r:embed="rId54"/>
                           <a:stretch>
                             <a:fillRect/>
                           </a:stretch>
@@ -15632,7 +15628,7 @@
               <w:t xml:space="preserve">Figure 5: Variable importance from W6 Random Survival Forest.</w:t>
             </w:r>
           </w:p>
-          <w:bookmarkEnd w:id="46"/>
+          <w:bookmarkEnd w:id="57"/>
         </w:tc>
       </w:tr>
     </w:tbl>
@@ -15649,8 +15645,8 @@
         <w:br w:type="page"/>
       </w:r>
     </w:p>
-    <w:bookmarkEnd w:id="47"/>
-    <w:bookmarkStart w:id="48" w:name="summary-and-interpretation"/>
+    <w:bookmarkEnd w:id="58"/>
+    <w:bookmarkStart w:id="59" w:name="summary-and-interpretation"/>
     <w:p>
       <w:pPr>
         <w:pStyle w:val="Heading2"/>
@@ -15684,8 +15680,8 @@
         <w:t xml:space="preserve">.</w:t>
       </w:r>
     </w:p>
-    <w:bookmarkEnd w:id="48"/>
-    <w:bookmarkStart w:id="49" w:name="strengths-and-limitations"/>
+    <w:bookmarkEnd w:id="59"/>
+    <w:bookmarkStart w:id="60" w:name="strengths-and-limitations"/>
     <w:p>
       <w:pPr>
         <w:pStyle w:val="Heading2"/>
@@ -15710,8 +15706,8 @@
         <w:t xml:space="preserve">Several limitations should also be noted. First, BMI was based on self-reported height and weight, which may introduce measurement error. Second, dementia classification relied on the Langa-Weir algorithm applied to cognitive test scores rather than clinical diagnosis, which may result in misclassification. Third, the complete-case approach to handling missing covariates may have introduced selection bias if missingness was not random. Fourth, we did not account for death as a competing risk; individuals who died before developing dementia were treated as censored, which may bias results if BMI variability is also associated with mortality. Finally, the W9 landmark analysis had limited statistical power due to the small number of events (N = 63), and the separation issues observed in some covariate categories at later waves suggest caution in interpreting those results.</w:t>
       </w:r>
     </w:p>
-    <w:bookmarkEnd w:id="49"/>
-    <w:bookmarkStart w:id="50" w:name="conclusions"/>
+    <w:bookmarkEnd w:id="60"/>
+    <w:bookmarkStart w:id="61" w:name="conclusions"/>
     <w:p>
       <w:pPr>
         <w:pStyle w:val="Heading2"/>
@@ -15733,9 +15729,9 @@
         <w:br w:type="page"/>
       </w:r>
     </w:p>
-    <w:bookmarkEnd w:id="50"/>
-    <w:bookmarkEnd w:id="51"/>
-    <w:bookmarkStart w:id="69" w:name="references"/>
+    <w:bookmarkEnd w:id="61"/>
+    <w:bookmarkEnd w:id="62"/>
+    <w:bookmarkStart w:id="80" w:name="references"/>
     <w:p>
       <w:pPr>
         <w:pStyle w:val="Heading1"/>
@@ -15744,8 +15740,8 @@
         <w:t xml:space="preserve">5. References</w:t>
       </w:r>
     </w:p>
-    <w:bookmarkStart w:id="68" w:name="refs"/>
-    <w:bookmarkStart w:id="53" w:name="ref-fitzpatrick2009"/>
+    <w:bookmarkStart w:id="79" w:name="refs"/>
+    <w:bookmarkStart w:id="64" w:name="ref-fitzpatrick2009"/>
     <w:p>
       <w:pPr>
         <w:pStyle w:val="Bibliography"/>
@@ -15778,7 +15774,7 @@
       <w:r>
         <w:t xml:space="preserve">[electronic article]. 2009;66(3):336–342. (</w:t>
       </w:r>
-      <w:hyperlink r:id="rId52">
+      <w:hyperlink r:id="rId63">
         <w:r>
           <w:rPr>
             <w:rStyle w:val="Hyperlink"/>
@@ -15790,8 +15786,8 @@
         <w:t xml:space="preserve">)</w:t>
       </w:r>
     </w:p>
-    <w:bookmarkEnd w:id="53"/>
-    <w:bookmarkStart w:id="55" w:name="ref-li2021"/>
+    <w:bookmarkEnd w:id="64"/>
+    <w:bookmarkStart w:id="66" w:name="ref-li2021"/>
     <w:p>
       <w:pPr>
         <w:pStyle w:val="Bibliography"/>
@@ -15824,7 +15820,7 @@
       <w:r>
         <w:t xml:space="preserve">[electronic article]. 2021;190(12):2503–2510. (</w:t>
       </w:r>
-      <w:hyperlink r:id="rId54">
+      <w:hyperlink r:id="rId65">
         <w:r>
           <w:rPr>
             <w:rStyle w:val="Hyperlink"/>
@@ -15836,8 +15832,8 @@
         <w:t xml:space="preserve">)</w:t>
       </w:r>
     </w:p>
-    <w:bookmarkEnd w:id="55"/>
-    <w:bookmarkStart w:id="57" w:name="ref-kivimaki2018"/>
+    <w:bookmarkEnd w:id="66"/>
+    <w:bookmarkStart w:id="68" w:name="ref-kivimaki2018"/>
     <w:p>
       <w:pPr>
         <w:pStyle w:val="Bibliography"/>
@@ -15870,7 +15866,7 @@
       <w:r>
         <w:t xml:space="preserve">[electronic article]. 2018;14(5):601–609. (</w:t>
       </w:r>
-      <w:hyperlink r:id="rId56">
+      <w:hyperlink r:id="rId67">
         <w:r>
           <w:rPr>
             <w:rStyle w:val="Hyperlink"/>
@@ -15882,8 +15878,8 @@
         <w:t xml:space="preserve">)</w:t>
       </w:r>
     </w:p>
-    <w:bookmarkEnd w:id="57"/>
-    <w:bookmarkStart w:id="59" w:name="ref-singhmanoux2018"/>
+    <w:bookmarkEnd w:id="68"/>
+    <w:bookmarkStart w:id="70" w:name="ref-singhmanoux2018"/>
     <w:p>
       <w:pPr>
         <w:pStyle w:val="Bibliography"/>
@@ -15916,7 +15912,7 @@
       <w:r>
         <w:t xml:space="preserve">[electronic article]. 2018;14(2):178–186. (</w:t>
       </w:r>
-      <w:hyperlink r:id="rId58">
+      <w:hyperlink r:id="rId69">
         <w:r>
           <w:rPr>
             <w:rStyle w:val="Hyperlink"/>
@@ -15928,8 +15924,8 @@
         <w:t xml:space="preserve">)</w:t>
       </w:r>
     </w:p>
-    <w:bookmarkEnd w:id="59"/>
-    <w:bookmarkStart w:id="61" w:name="ref-beeri2022"/>
+    <w:bookmarkEnd w:id="70"/>
+    <w:bookmarkStart w:id="72" w:name="ref-beeri2022"/>
     <w:p>
       <w:pPr>
         <w:pStyle w:val="Bibliography"/>
@@ -15962,7 +15958,7 @@
       <w:r>
         <w:t xml:space="preserve">[electronic article]. 2022;18(11):2131–2139. (</w:t>
       </w:r>
-      <w:hyperlink r:id="rId60">
+      <w:hyperlink r:id="rId71">
         <w:r>
           <w:rPr>
             <w:rStyle w:val="Hyperlink"/>
@@ -15974,8 +15970,8 @@
         <w:t xml:space="preserve">)</w:t>
       </w:r>
     </w:p>
-    <w:bookmarkEnd w:id="61"/>
-    <w:bookmarkStart w:id="63" w:name="ref-guo2022"/>
+    <w:bookmarkEnd w:id="72"/>
+    <w:bookmarkStart w:id="74" w:name="ref-guo2022"/>
     <w:p>
       <w:pPr>
         <w:pStyle w:val="Bibliography"/>
@@ -16008,7 +16004,7 @@
       <w:r>
         <w:t xml:space="preserve">[electronic article]. 2022;79(12):1180–1187. (</w:t>
       </w:r>
-      <w:hyperlink r:id="rId62">
+      <w:hyperlink r:id="rId73">
         <w:r>
           <w:rPr>
             <w:rStyle w:val="Hyperlink"/>
@@ -16020,8 +16016,8 @@
         <w:t xml:space="preserve">)</w:t>
       </w:r>
     </w:p>
-    <w:bookmarkEnd w:id="63"/>
-    <w:bookmarkStart w:id="65" w:name="ref-xu2025"/>
+    <w:bookmarkEnd w:id="74"/>
+    <w:bookmarkStart w:id="76" w:name="ref-xu2025"/>
     <w:p>
       <w:pPr>
         <w:pStyle w:val="Bibliography"/>
@@ -16041,7 +16037,7 @@
       <w:r>
         <w:t xml:space="preserve"> </w:t>
       </w:r>
-      <w:hyperlink r:id="rId64">
+      <w:hyperlink r:id="rId75">
         <w:r>
           <w:rPr>
             <w:rStyle w:val="Hyperlink"/>
@@ -16066,8 +16062,8 @@
         <w:t xml:space="preserve">. 2025;</w:t>
       </w:r>
     </w:p>
-    <w:bookmarkEnd w:id="65"/>
-    <w:bookmarkStart w:id="67" w:name="ref-mahinrad2023"/>
+    <w:bookmarkEnd w:id="76"/>
+    <w:bookmarkStart w:id="78" w:name="ref-mahinrad2023"/>
     <w:p>
       <w:pPr>
         <w:pStyle w:val="Bibliography"/>
@@ -16100,7 +16096,7 @@
       <w:r>
         <w:t xml:space="preserve">[electronic article]. 2023;19(7):2966–2974. (</w:t>
       </w:r>
-      <w:hyperlink r:id="rId66">
+      <w:hyperlink r:id="rId77">
         <w:r>
           <w:rPr>
             <w:rStyle w:val="Hyperlink"/>
@@ -16112,9 +16108,9 @@
         <w:t xml:space="preserve">)</w:t>
       </w:r>
     </w:p>
-    <w:bookmarkEnd w:id="67"/>
-    <w:bookmarkEnd w:id="68"/>
-    <w:bookmarkEnd w:id="69"/>
+    <w:bookmarkEnd w:id="78"/>
+    <w:bookmarkEnd w:id="79"/>
+    <w:bookmarkEnd w:id="80"/>
     <w:sectPr>
       <w:footnotePr>
         <w:numRestart w:val="eachSect"/>
@@ -16457,10 +16453,10 @@
   <w:docDefaults>
     <w:rPrDefault>
       <w:rPr>
-        <w:rFonts w:asciiTheme="minorHAnsi" w:cstheme="minorBidi" w:eastAsiaTheme="minorEastAsia" w:hAnsiTheme="minorHAnsi"/>
+        <w:rFonts w:asciiTheme="minorHAnsi" w:cstheme="minorBidi" w:eastAsiaTheme="minorHAnsi" w:hAnsiTheme="minorHAnsi"/>
         <w:sz w:val="24"/>
         <w:szCs w:val="24"/>
-        <w:lang w:bidi="ar-SA" w:eastAsia="zh-CN" w:val="en-US"/>
+        <w:lang w:bidi="ar-SA" w:eastAsia="en-US" w:val="en-US"/>
       </w:rPr>
     </w:rPrDefault>
     <w:pPrDefault>
@@ -17001,6 +16997,13 @@
       </w:tblCellMar>
     </w:tblPr>
     <w:tblStylePr w:type="firstRow">
+      <w:tblPr>
+        <w:jc w:val="left"/>
+        <w:tblInd w:type="dxa" w:w="0"/>
+      </w:tblPr>
+      <w:trPr>
+        <w:jc w:val="left"/>
+      </w:trPr>
       <w:tcPr>
         <w:tcBorders>
           <w:bottom w:val="single"/>

</xml_diff>